<commit_message>
fix: update Wanderlust live URL from Render to Vercel
Updated Wanderlust deployment URL across all 3 files:
- src/lib/portfolio-data.ts (portfolio featured card)
- scripts/gen-resume-pdf.py (resume PDF)
- scripts/gen-resume-docx.js (resume DOCX)

Old: https://wanderlust-nodejs-project.onrender.com/listings
New: https://wanderlust-nodejs-project-rho.vercel.app/

Also updated resume bullet text: 'Deployed on Render' -> 'Deployed on Vercel'

Verified: new Vercel URL returns HTTP 200 (live), portfolio Live Demo button
points to new URL, resume PDF regenerated with correct clickable link.
</commit_message>
<xml_diff>
--- a/Kashyap-Patel-Resume.docx
+++ b/Kashyap-Patel-Resume.docx
@@ -39,7 +39,7 @@
         <w:spacing w:after="200"/>
         <w:jc w:val="center"/>
       </w:pPr>
-      <w:hyperlink w:history="1" r:id="rIde_f7pcpivkhwgwaky131z">
+      <w:hyperlink w:history="1" r:id="rIdwjp7n8cvmljvqzr-xvr1w">
         <w:r>
           <w:rPr>
             <w:rFonts w:ascii="Arial" w:cs="Arial" w:eastAsia="Arial" w:hAnsi="Arial"/>
@@ -59,7 +59,7 @@
         </w:rPr>
         <w:t xml:space="preserve">  |  India  |  </w:t>
       </w:r>
-      <w:hyperlink w:history="1" r:id="rIdk_el8bjjnvtytkbl1r3lp">
+      <w:hyperlink w:history="1" r:id="rIdiecpxsvbjs438zgptato7">
         <w:r>
           <w:rPr>
             <w:rFonts w:ascii="Arial" w:cs="Arial" w:eastAsia="Arial" w:hAnsi="Arial"/>
@@ -79,7 +79,7 @@
         </w:rPr>
         <w:t xml:space="preserve">  |  </w:t>
       </w:r>
-      <w:hyperlink w:history="1" r:id="rIdk30q6xuos2hmvfup5caka">
+      <w:hyperlink w:history="1" r:id="rId4tgkfbjq50kepy220hhmu">
         <w:r>
           <w:rPr>
             <w:rFonts w:ascii="Arial" w:cs="Arial" w:eastAsia="Arial" w:hAnsi="Arial"/>
@@ -99,7 +99,7 @@
         </w:rPr>
         <w:t xml:space="preserve">  |  </w:t>
       </w:r>
-      <w:hyperlink w:history="1" r:id="rIdgfgblcgbdbcl30cimm1iz">
+      <w:hyperlink w:history="1" r:id="rIdjtv8qarzrzb-apnw6gvrw">
         <w:r>
           <w:rPr>
             <w:rFonts w:ascii="Arial" w:cs="Arial" w:eastAsia="Arial" w:hAnsi="Arial"/>
@@ -707,7 +707,7 @@
       <w:pPr>
         <w:spacing w:after="40"/>
       </w:pPr>
-      <w:hyperlink w:history="1" r:id="rIdlqpaaqd-4ksk3qrehp8lq">
+      <w:hyperlink w:history="1" r:id="rIdxwjap6cljbl1yffdrpcxb">
         <w:r>
           <w:rPr>
             <w:rFonts w:ascii="Arial" w:cs="Arial" w:eastAsia="Arial" w:hAnsi="Arial"/>
@@ -727,7 +727,7 @@
         </w:rPr>
         <w:t xml:space="preserve">  |  </w:t>
       </w:r>
-      <w:hyperlink w:history="1" r:id="rIdvysmopxc_7pl4rnhv9bdj">
+      <w:hyperlink w:history="1" r:id="rId3e-fawibuywwdm2dnf5iq">
         <w:r>
           <w:rPr>
             <w:rFonts w:ascii="Arial" w:cs="Arial" w:eastAsia="Arial" w:hAnsi="Arial"/>
@@ -797,7 +797,7 @@
       <w:pPr>
         <w:spacing w:after="40"/>
       </w:pPr>
-      <w:hyperlink w:history="1" r:id="rIdiryojcqoj_34n11no_av8">
+      <w:hyperlink w:history="1" r:id="rId7kpbamoyxmweq4ewfqhwq">
         <w:r>
           <w:rPr>
             <w:rFonts w:ascii="Arial" w:cs="Arial" w:eastAsia="Arial" w:hAnsi="Arial"/>
@@ -817,7 +817,7 @@
         </w:rPr>
         <w:t xml:space="preserve">  |  </w:t>
       </w:r>
-      <w:hyperlink w:history="1" r:id="rId4gdf7-qtesdiecrjqzrhg">
+      <w:hyperlink w:history="1" r:id="rIdky4yoiknwga2jihy7kr7k">
         <w:r>
           <w:rPr>
             <w:rFonts w:ascii="Arial" w:cs="Arial" w:eastAsia="Arial" w:hAnsi="Arial"/>
@@ -887,7 +887,7 @@
       <w:pPr>
         <w:spacing w:after="40"/>
       </w:pPr>
-      <w:hyperlink w:history="1" r:id="rId9ym5b0dzy9pjzkam3tggu">
+      <w:hyperlink w:history="1" r:id="rIdveppvabmsgtmdxeqmjjfy">
         <w:r>
           <w:rPr>
             <w:rFonts w:ascii="Arial" w:cs="Arial" w:eastAsia="Arial" w:hAnsi="Arial"/>
@@ -907,7 +907,7 @@
         </w:rPr>
         <w:t xml:space="preserve">  |  </w:t>
       </w:r>
-      <w:hyperlink w:history="1" r:id="rIda3ol45norfoflejvvrw2s">
+      <w:hyperlink w:history="1" r:id="rId6di3l3xrhfenpunoix76m">
         <w:r>
           <w:rPr>
             <w:rFonts w:ascii="Arial" w:cs="Arial" w:eastAsia="Arial" w:hAnsi="Arial"/>
@@ -940,7 +940,7 @@
           <w:sz w:val="20"/>
           <w:szCs w:val="20"/>
         </w:rPr>
-        <w:t xml:space="preserve">Full-stack MERN travel listings platform with CRUD operations, JWT authentication, map geolocation, and image upload integration. Deployed on Render.</w:t>
+        <w:t xml:space="preserve">Full-stack MERN travel listings platform with CRUD operations, JWT authentication, map geolocation, and image upload integration. Deployed on Vercel.</w:t>
       </w:r>
     </w:p>
     <w:p>

</xml_diff>